<commit_message>
Adiciona analises complementares (Lorenz, AME, calibracao, contrafactual) e remove subtitulo dos titulos
</commit_message>
<xml_diff>
--- a/[Resultados Preliminares] - Maycon Henrique Aranha Da Silva.docx
+++ b/[Resultados Preliminares] - Maycon Henrique Aranha Da Silva.docx
@@ -10,9 +10,11 @@
       <w:r>
         <w:rPr>
           <w:rFonts w:ascii="Arial" w:hAnsi="Arial"/>
+          <w:b w:val="0"/>
+          <w:i w:val="0"/>
           <w:sz w:val="22"/>
         </w:rPr>
-        <w:t>Fatores determinantes da insatisfação do consumidor no e-commerce: aplicação de regressão para dados de contagem</w:t>
+        <w:t>Fatores determinantes da insatisfação do consumidor no e-commerce</w:t>
       </w:r>
     </w:p>
     <w:p>
@@ -43,9 +45,11 @@
       <w:r>
         <w:rPr>
           <w:rFonts w:ascii="Arial" w:hAnsi="Arial"/>
+          <w:b w:val="0"/>
+          <w:i w:val="0"/>
           <w:sz w:val="22"/>
         </w:rPr>
-        <w:t>Fatores determinantes da insatisfação do consumidor no e-commerce: aplicação de regressão para dados de contagem</w:t>
+        <w:t>Fatores determinantes da insatisfação do consumidor no e-commerce</w:t>
       </w:r>
     </w:p>
     <w:p>
@@ -65,7 +69,7 @@
     </w:p>
     <w:p>
       <w:pPr>
-        <w:spacing w:before="0" w:after="80" w:line="330" w:lineRule="exact"/>
+        <w:spacing w:before="0" w:after="80" w:line="220" w:lineRule="exact"/>
         <w:jc w:val="both"/>
       </w:pPr>
       <w:r>
@@ -80,7 +84,7 @@
     </w:p>
     <w:p>
       <w:pPr>
-        <w:spacing w:before="0" w:after="120" w:line="330" w:lineRule="exact"/>
+        <w:spacing w:before="0" w:after="120" w:line="220" w:lineRule="exact"/>
         <w:jc w:val="both"/>
       </w:pPr>
       <w:r>
@@ -195,7 +199,7 @@
           <w:i w:val="0"/>
           <w:sz w:val="22"/>
         </w:rPr>
-        <w:t>A pesquisa possui caráter quantitativo e descritivo, apoiada em dados secundários de acesso público. A base utilizada foi o Brazilian E-Commerce Public Dataset, disponibilizado pela Olist na plataforma Kaggle (Olist, 2018), com registros de aproximadamente 100 mil pedidos realizados em marketplaces brasileiros entre 2016 e 2018, distribuídos em sete tabelas relacionais: pedidos, itens de pedido, pagamentos, avaliações, produtos, vendedores e tradução de categorias de produto. Por se tratar de dados de acesso público, a pesquisa foi dispensada de submissão ao Comitê de Ética em Pesquisa, conforme o parágrafo único do art. 1º, inciso II, da Resolução CNS nº 510/2016, o que foi confirmado pelo preenchimento do Formulário de Direcionamento Ético (FDE).</w:t>
+        <w:t>A pesquisa possui caráter quantitativo e descritivo, apoiada em dados secundários de acesso público. A base utilizada foi o Brazilian E-Commerce Public Dataset, disponibilizado pela Olist na plataforma Kaggle (Olist, 2018), com registros de aproximadamente 100 mil pedidos realizados em marketplaces brasileiros entre 2016 e 2018, distribuídos em sete tabelas relacionais: pedidos, itens de pedido, pagamentos, avaliações, produtos, vendedores e tradução de categorias de produto. Por utilizar apenas dados de acesso público, a pesquisa foi dispensada de submissão ao Comitê de Ética em Pesquisa, conforme confirmado pelo Formulário de Direcionamento Ético (FDE).</w:t>
       </w:r>
     </w:p>
     <w:p>
@@ -1327,7 +1331,7 @@
     </w:p>
     <w:p>
       <w:pPr>
-        <w:spacing w:line="330" w:lineRule="exact" w:before="0" w:after="120"/>
+        <w:spacing w:before="0" w:after="120" w:line="330" w:lineRule="exact"/>
         <w:jc w:val="both"/>
       </w:pPr>
       <w:r>
@@ -2748,7 +2752,7 @@
     </w:p>
     <w:p>
       <w:pPr>
-        <w:spacing w:line="330" w:lineRule="exact" w:before="0" w:after="120"/>
+        <w:spacing w:before="0" w:after="120" w:line="330" w:lineRule="exact"/>
         <w:jc w:val="both"/>
       </w:pPr>
       <w:r>
@@ -2763,7 +2767,7 @@
     </w:p>
     <w:p>
       <w:pPr>
-        <w:spacing w:line="330" w:lineRule="exact" w:before="0" w:after="120"/>
+        <w:spacing w:before="0" w:after="120" w:line="330" w:lineRule="exact"/>
         <w:jc w:val="both"/>
       </w:pPr>
       <w:r>
@@ -2778,7 +2782,7 @@
     </w:p>
     <w:p>
       <w:pPr>
-        <w:spacing w:line="330" w:lineRule="exact" w:before="0" w:after="120"/>
+        <w:spacing w:before="0" w:after="120" w:line="330" w:lineRule="exact"/>
         <w:jc w:val="both"/>
       </w:pPr>
       <w:r>
@@ -2804,6 +2808,966 @@
           <w:sz w:val="22"/>
         </w:rPr>
         <w:t>Modelos inflacionados de zeros (ZIP e ZINB) foram considerados como alternativas, dada a ocorrência de aproximadamente 21% de zeros na variável dependente (Lambert, 1992). A comparação entre o NB2 reduzido e o ZINB de mesma especificação no componente de contagem foi conduzida pelo teste de Vuong (1989), que não indicou superioridade estatística do ZINB sobre o NB2 (z = 0,0010; p = 0,4996). O critério AIC também favoreceu o NB2 (6.976,7) frente ao ZINB (6.978,7). A especificação NB2 foi mantida por acomodar satisfatoriamente os zeros amostrais sem a complexidade adicional de um componente inflado de zeros (Fávero, Duarte e Santos, 2024).</w:t>
+      </w:r>
+    </w:p>
+    <w:p>
+      <w:pPr>
+        <w:spacing w:before="200" w:after="80" w:line="330" w:lineRule="exact"/>
+        <w:ind w:left="709"/>
+        <w:jc w:val="left"/>
+      </w:pPr>
+      <w:r>
+        <w:rPr>
+          <w:rFonts w:ascii="Arial" w:hAnsi="Arial"/>
+          <w:b/>
+          <w:i w:val="0"/>
+          <w:sz w:val="22"/>
+        </w:rPr>
+        <w:t>Concentração da insatisfação entre vendedores</w:t>
+      </w:r>
+    </w:p>
+    <w:p>
+      <w:pPr>
+        <w:spacing w:before="0" w:after="120" w:line="330" w:lineRule="exact"/>
+        <w:jc w:val="both"/>
+      </w:pPr>
+      <w:r>
+        <w:rPr>
+          <w:rFonts w:ascii="Arial" w:hAnsi="Arial"/>
+          <w:b w:val="0"/>
+          <w:i w:val="0"/>
+          <w:sz w:val="22"/>
+        </w:rPr>
+        <w:t>A distribuição dos reviews negativos entre vendedores não é homogênea. A curva de Lorenz construída sobre a contagem de reviews negativos por vendedor apresentou coeficiente de Gini de 0,747, indicando concentração elevada. Os 20% de vendedores com maior número de reviews negativos respondem por 77,9% do total registrado na base; os 10% mais expostos concentram 62,8%. Esse padrão é consistente com o comportamento típico de marketplaces, em que um conjunto minoritário de lojistas responde por parcela desproporcional das reclamações, e ajuda a contextualizar o foco analítico do modelo proposto.</w:t>
+      </w:r>
+    </w:p>
+    <w:p>
+      <w:pPr>
+        <w:spacing w:before="200" w:after="40" w:line="220" w:lineRule="exact"/>
+        <w:jc w:val="left"/>
+      </w:pPr>
+      <w:r>
+        <w:rPr>
+          <w:rFonts w:ascii="Arial" w:hAnsi="Arial"/>
+          <w:b w:val="0"/>
+          <w:i w:val="0"/>
+          <w:sz w:val="22"/>
+        </w:rPr>
+        <w:t>Figura 6. Curva de Lorenz da contagem de reviews negativos por vendedor</w:t>
+      </w:r>
+    </w:p>
+    <w:p>
+      <w:pPr>
+        <w:spacing w:after="40"/>
+        <w:jc w:val="center"/>
+      </w:pPr>
+      <w:r>
+        <w:drawing>
+          <wp:inline xmlns:a="http://schemas.openxmlformats.org/drawingml/2006/main" xmlns:pic="http://schemas.openxmlformats.org/drawingml/2006/picture">
+            <wp:extent cx="5029200" cy="3762626"/>
+            <wp:docPr id="6" name="Picture 6"/>
+            <wp:cNvGraphicFramePr>
+              <a:graphicFrameLocks noChangeAspect="1"/>
+            </wp:cNvGraphicFramePr>
+            <a:graphic>
+              <a:graphicData uri="http://schemas.openxmlformats.org/drawingml/2006/picture">
+                <pic:pic>
+                  <pic:nvPicPr>
+                    <pic:cNvPr id="0" name="fig_lorenz.png"/>
+                    <pic:cNvPicPr/>
+                  </pic:nvPicPr>
+                  <pic:blipFill>
+                    <a:blip r:embed="rId14"/>
+                    <a:stretch>
+                      <a:fillRect/>
+                    </a:stretch>
+                  </pic:blipFill>
+                  <pic:spPr>
+                    <a:xfrm>
+                      <a:off x="0" y="0"/>
+                      <a:ext cx="5029200" cy="3762626"/>
+                    </a:xfrm>
+                    <a:prstGeom prst="rect"/>
+                  </pic:spPr>
+                </pic:pic>
+              </a:graphicData>
+            </a:graphic>
+          </wp:inline>
+        </w:drawing>
+      </w:r>
+    </w:p>
+    <w:p>
+      <w:pPr>
+        <w:spacing w:before="40" w:after="160" w:line="220" w:lineRule="exact"/>
+        <w:jc w:val="left"/>
+      </w:pPr>
+      <w:r>
+        <w:rPr>
+          <w:rFonts w:ascii="Arial" w:hAnsi="Arial"/>
+          <w:b w:val="0"/>
+          <w:i w:val="0"/>
+          <w:sz w:val="18"/>
+        </w:rPr>
+        <w:t>Fonte: Resultados originais da pesquisa.</w:t>
+      </w:r>
+    </w:p>
+    <w:p>
+      <w:pPr>
+        <w:spacing w:before="200" w:after="80" w:line="330" w:lineRule="exact"/>
+        <w:ind w:left="709"/>
+        <w:jc w:val="left"/>
+      </w:pPr>
+      <w:r>
+        <w:rPr>
+          <w:rFonts w:ascii="Arial" w:hAnsi="Arial"/>
+          <w:b/>
+          <w:i w:val="0"/>
+          <w:sz w:val="22"/>
+        </w:rPr>
+        <w:t>Efeitos marginais médios</w:t>
+      </w:r>
+    </w:p>
+    <w:p>
+      <w:pPr>
+        <w:spacing w:before="0" w:after="120" w:line="330" w:lineRule="exact"/>
+        <w:jc w:val="both"/>
+      </w:pPr>
+      <w:r>
+        <w:rPr>
+          <w:rFonts w:ascii="Arial" w:hAnsi="Arial"/>
+          <w:b w:val="0"/>
+          <w:i w:val="0"/>
+          <w:sz w:val="22"/>
+        </w:rPr>
+        <w:t>Como complemento à interpretação por exp(βⱼ), foram calculados os efeitos marginais médios (AME) das variáveis contínuas significativas, traduzindo os coeficientes em variação esperada na contagem de reviews negativos para o vendedor médio da amostra. O AME do atraso médio foi de 0,29 review negativo adicional por dia, e o do frete médio foi de 0,04 review por real, conforme a Tabela 5. Os valores absolutos são pequenos quando avaliados por unidade, mas tornam-se relevantes quando agregados ao volume total da plataforma.</w:t>
+      </w:r>
+    </w:p>
+    <w:p>
+      <w:pPr>
+        <w:spacing w:before="200" w:after="40" w:line="220" w:lineRule="exact"/>
+        <w:jc w:val="left"/>
+      </w:pPr>
+      <w:r>
+        <w:rPr>
+          <w:rFonts w:ascii="Arial" w:hAnsi="Arial"/>
+          <w:b w:val="0"/>
+          <w:i w:val="0"/>
+          <w:sz w:val="22"/>
+        </w:rPr>
+        <w:t>Tabela 5. Efeitos marginais médios — modelo NB2 reduzido</w:t>
+      </w:r>
+    </w:p>
+    <w:tbl>
+      <w:tblPr>
+        <w:tblStyle w:val="TableGrid"/>
+        <w:tblW w:type="auto" w:w="0"/>
+        <w:jc w:val="center"/>
+        <w:tblLook w:firstColumn="1" w:firstRow="1" w:lastColumn="0" w:lastRow="0" w:noHBand="0" w:noVBand="1" w:val="04A0"/>
+      </w:tblPr>
+      <w:tblGrid>
+        <w:gridCol w:w="3135"/>
+        <w:gridCol w:w="3135"/>
+        <w:gridCol w:w="3135"/>
+      </w:tblGrid>
+      <w:tr>
+        <w:tc>
+          <w:tcPr>
+            <w:tcW w:type="dxa" w:w="3135"/>
+          </w:tcPr>
+          <w:p>
+            <w:pPr>
+              <w:jc w:val="center"/>
+            </w:pPr>
+            <w:r>
+              <w:rPr>
+                <w:rFonts w:ascii="Arial" w:hAnsi="Arial"/>
+                <w:b/>
+                <w:i w:val="0"/>
+                <w:sz w:val="20"/>
+              </w:rPr>
+              <w:t>Variável</w:t>
+            </w:r>
+          </w:p>
+        </w:tc>
+        <w:tc>
+          <w:tcPr>
+            <w:tcW w:type="dxa" w:w="3135"/>
+          </w:tcPr>
+          <w:p>
+            <w:pPr>
+              <w:jc w:val="center"/>
+            </w:pPr>
+            <w:r>
+              <w:rPr>
+                <w:rFonts w:ascii="Arial" w:hAnsi="Arial"/>
+                <w:b/>
+                <w:i w:val="0"/>
+                <w:sz w:val="20"/>
+              </w:rPr>
+              <w:t>AME (reviews negativos)</w:t>
+            </w:r>
+          </w:p>
+        </w:tc>
+        <w:tc>
+          <w:tcPr>
+            <w:tcW w:type="dxa" w:w="3135"/>
+          </w:tcPr>
+          <w:p>
+            <w:pPr>
+              <w:jc w:val="center"/>
+            </w:pPr>
+            <w:r>
+              <w:rPr>
+                <w:rFonts w:ascii="Arial" w:hAnsi="Arial"/>
+                <w:b/>
+                <w:i w:val="0"/>
+                <w:sz w:val="20"/>
+              </w:rPr>
+              <w:t>Unidade</w:t>
+            </w:r>
+          </w:p>
+        </w:tc>
+      </w:tr>
+      <w:tr>
+        <w:tc>
+          <w:tcPr>
+            <w:tcW w:type="dxa" w:w="3135"/>
+          </w:tcPr>
+          <w:p>
+            <w:r>
+              <w:rPr>
+                <w:rFonts w:ascii="Arial" w:hAnsi="Arial"/>
+                <w:b w:val="0"/>
+                <w:i w:val="0"/>
+                <w:sz w:val="20"/>
+              </w:rPr>
+              <w:t>Atraso médio</w:t>
+            </w:r>
+          </w:p>
+        </w:tc>
+        <w:tc>
+          <w:tcPr>
+            <w:tcW w:type="dxa" w:w="3135"/>
+          </w:tcPr>
+          <w:p>
+            <w:pPr>
+              <w:jc w:val="center"/>
+            </w:pPr>
+            <w:r>
+              <w:rPr>
+                <w:rFonts w:ascii="Arial" w:hAnsi="Arial"/>
+                <w:b w:val="0"/>
+                <w:i w:val="0"/>
+                <w:sz w:val="20"/>
+              </w:rPr>
+              <w:t>0,29</w:t>
+            </w:r>
+          </w:p>
+        </w:tc>
+        <w:tc>
+          <w:tcPr>
+            <w:tcW w:type="dxa" w:w="3135"/>
+          </w:tcPr>
+          <w:p>
+            <w:pPr>
+              <w:jc w:val="center"/>
+            </w:pPr>
+            <w:r>
+              <w:rPr>
+                <w:rFonts w:ascii="Arial" w:hAnsi="Arial"/>
+                <w:b w:val="0"/>
+                <w:i w:val="0"/>
+                <w:sz w:val="20"/>
+              </w:rPr>
+              <w:t>por dia</w:t>
+            </w:r>
+          </w:p>
+        </w:tc>
+      </w:tr>
+      <w:tr>
+        <w:tc>
+          <w:tcPr>
+            <w:tcW w:type="dxa" w:w="3135"/>
+          </w:tcPr>
+          <w:p>
+            <w:r>
+              <w:rPr>
+                <w:rFonts w:ascii="Arial" w:hAnsi="Arial"/>
+                <w:b w:val="0"/>
+                <w:i w:val="0"/>
+                <w:sz w:val="20"/>
+              </w:rPr>
+              <w:t>Frete médio</w:t>
+            </w:r>
+          </w:p>
+        </w:tc>
+        <w:tc>
+          <w:tcPr>
+            <w:tcW w:type="dxa" w:w="3135"/>
+          </w:tcPr>
+          <w:p>
+            <w:pPr>
+              <w:jc w:val="center"/>
+            </w:pPr>
+            <w:r>
+              <w:rPr>
+                <w:rFonts w:ascii="Arial" w:hAnsi="Arial"/>
+                <w:b w:val="0"/>
+                <w:i w:val="0"/>
+                <w:sz w:val="20"/>
+              </w:rPr>
+              <w:t>0,04</w:t>
+            </w:r>
+          </w:p>
+        </w:tc>
+        <w:tc>
+          <w:tcPr>
+            <w:tcW w:type="dxa" w:w="3135"/>
+          </w:tcPr>
+          <w:p>
+            <w:pPr>
+              <w:jc w:val="center"/>
+            </w:pPr>
+            <w:r>
+              <w:rPr>
+                <w:rFonts w:ascii="Arial" w:hAnsi="Arial"/>
+                <w:b w:val="0"/>
+                <w:i w:val="0"/>
+                <w:sz w:val="20"/>
+              </w:rPr>
+              <w:t>por R$</w:t>
+            </w:r>
+          </w:p>
+        </w:tc>
+      </w:tr>
+    </w:tbl>
+    <w:p>
+      <w:pPr>
+        <w:spacing w:before="40" w:after="40" w:line="220" w:lineRule="exact"/>
+        <w:jc w:val="left"/>
+      </w:pPr>
+      <w:r>
+        <w:rPr>
+          <w:rFonts w:ascii="Arial" w:hAnsi="Arial"/>
+          <w:b w:val="0"/>
+          <w:i w:val="0"/>
+          <w:sz w:val="18"/>
+        </w:rPr>
+        <w:t>Fonte: Resultados originais da pesquisa.</w:t>
+      </w:r>
+    </w:p>
+    <w:p>
+      <w:pPr>
+        <w:spacing w:before="0" w:after="160" w:line="220" w:lineRule="exact"/>
+        <w:jc w:val="left"/>
+      </w:pPr>
+      <w:r>
+        <w:rPr>
+          <w:rFonts w:ascii="Arial" w:hAnsi="Arial"/>
+          <w:b w:val="0"/>
+          <w:i w:val="0"/>
+          <w:sz w:val="18"/>
+        </w:rPr>
+        <w:t>Nota: AME calculado como média de μᵢ · βⱼ sobre todos os vendedores da amostra.</w:t>
+      </w:r>
+    </w:p>
+    <w:p>
+      <w:pPr>
+        <w:spacing w:before="200" w:after="80" w:line="330" w:lineRule="exact"/>
+        <w:ind w:left="709"/>
+        <w:jc w:val="left"/>
+      </w:pPr>
+      <w:r>
+        <w:rPr>
+          <w:rFonts w:ascii="Arial" w:hAnsi="Arial"/>
+          <w:b/>
+          <w:i w:val="0"/>
+          <w:sz w:val="22"/>
+        </w:rPr>
+        <w:t>Calibração do modelo</w:t>
+      </w:r>
+    </w:p>
+    <w:p>
+      <w:pPr>
+        <w:spacing w:before="0" w:after="120" w:line="330" w:lineRule="exact"/>
+        <w:jc w:val="both"/>
+      </w:pPr>
+      <w:r>
+        <w:rPr>
+          <w:rFonts w:ascii="Arial" w:hAnsi="Arial"/>
+          <w:b w:val="0"/>
+          <w:i w:val="0"/>
+          <w:sz w:val="22"/>
+        </w:rPr>
+        <w:t>A calibração do modelo foi avaliada pela comparação entre contagem prevista (μ) e contagem observada (y), tanto no nível individual quanto agregada por decis de predição, conforme a Figura 7. No nível individual, observa-se dispersão esperada para dados de contagem, e a média por decil aproxima-se da reta y = x ao longo de todo o espectro de predições, indicando ausência de viés sistemático de sub ou superpredição.</w:t>
+      </w:r>
+    </w:p>
+    <w:p>
+      <w:pPr>
+        <w:spacing w:before="200" w:after="40" w:line="220" w:lineRule="exact"/>
+        <w:jc w:val="left"/>
+      </w:pPr>
+      <w:r>
+        <w:rPr>
+          <w:rFonts w:ascii="Arial" w:hAnsi="Arial"/>
+          <w:b w:val="0"/>
+          <w:i w:val="0"/>
+          <w:sz w:val="22"/>
+        </w:rPr>
+        <w:t>Figura 7. Calibração — previsto versus observado, no nível individual e por decis</w:t>
+      </w:r>
+    </w:p>
+    <w:p>
+      <w:pPr>
+        <w:spacing w:after="40"/>
+        <w:jc w:val="center"/>
+      </w:pPr>
+      <w:r>
+        <w:drawing>
+          <wp:inline xmlns:a="http://schemas.openxmlformats.org/drawingml/2006/main" xmlns:pic="http://schemas.openxmlformats.org/drawingml/2006/picture">
+            <wp:extent cx="5029200" cy="1771821"/>
+            <wp:docPr id="7" name="Picture 7"/>
+            <wp:cNvGraphicFramePr>
+              <a:graphicFrameLocks noChangeAspect="1"/>
+            </wp:cNvGraphicFramePr>
+            <a:graphic>
+              <a:graphicData uri="http://schemas.openxmlformats.org/drawingml/2006/picture">
+                <pic:pic>
+                  <pic:nvPicPr>
+                    <pic:cNvPr id="0" name="fig_calibracao.png"/>
+                    <pic:cNvPicPr/>
+                  </pic:nvPicPr>
+                  <pic:blipFill>
+                    <a:blip r:embed="rId15"/>
+                    <a:stretch>
+                      <a:fillRect/>
+                    </a:stretch>
+                  </pic:blipFill>
+                  <pic:spPr>
+                    <a:xfrm>
+                      <a:off x="0" y="0"/>
+                      <a:ext cx="5029200" cy="1771821"/>
+                    </a:xfrm>
+                    <a:prstGeom prst="rect"/>
+                  </pic:spPr>
+                </pic:pic>
+              </a:graphicData>
+            </a:graphic>
+          </wp:inline>
+        </w:drawing>
+      </w:r>
+    </w:p>
+    <w:p>
+      <w:pPr>
+        <w:spacing w:before="40" w:after="160" w:line="220" w:lineRule="exact"/>
+        <w:jc w:val="left"/>
+      </w:pPr>
+      <w:r>
+        <w:rPr>
+          <w:rFonts w:ascii="Arial" w:hAnsi="Arial"/>
+          <w:b w:val="0"/>
+          <w:i w:val="0"/>
+          <w:sz w:val="18"/>
+        </w:rPr>
+        <w:t>Fonte: Resultados originais da pesquisa.</w:t>
+      </w:r>
+    </w:p>
+    <w:p>
+      <w:pPr>
+        <w:spacing w:before="200" w:after="80" w:line="330" w:lineRule="exact"/>
+        <w:ind w:left="709"/>
+        <w:jc w:val="left"/>
+      </w:pPr>
+      <w:r>
+        <w:rPr>
+          <w:rFonts w:ascii="Arial" w:hAnsi="Arial"/>
+          <w:b/>
+          <w:i w:val="0"/>
+          <w:sz w:val="22"/>
+        </w:rPr>
+        <w:t>Simulação contrafactual da redução de atraso</w:t>
+      </w:r>
+    </w:p>
+    <w:p>
+      <w:pPr>
+        <w:spacing w:before="0" w:after="120" w:line="330" w:lineRule="exact"/>
+        <w:jc w:val="both"/>
+      </w:pPr>
+      <w:r>
+        <w:rPr>
+          <w:rFonts w:ascii="Arial" w:hAnsi="Arial"/>
+          <w:b w:val="0"/>
+          <w:i w:val="0"/>
+          <w:sz w:val="22"/>
+        </w:rPr>
+        <w:t>Para traduzir o coeficiente do atraso em consequência operacional, foi conduzida uma simulação contrafactual. Considerando o conjunto de vendedores observados, a redução do atraso médio em 1, 2, 3, 5 e 7 dias foi aplicada de forma uniforme e comparada à predição base do modelo NB2 reduzido. Os resultados estão na Tabela 6 e na Figura 8. Uma redução de 3 dias no atraso médio levaria a uma queda estimada de 12,2% no total de reviews negativos previstos pelo modelo; uma redução de 7 dias, a uma queda de 26,3%. A simulação fornece uma referência quantitativa para priorização de iniciativas de melhoria logística, ressalvada a natureza associativa do modelo.</w:t>
+      </w:r>
+    </w:p>
+    <w:p>
+      <w:pPr>
+        <w:spacing w:before="200" w:after="40" w:line="220" w:lineRule="exact"/>
+        <w:jc w:val="left"/>
+      </w:pPr>
+      <w:r>
+        <w:rPr>
+          <w:rFonts w:ascii="Arial" w:hAnsi="Arial"/>
+          <w:b w:val="0"/>
+          <w:i w:val="0"/>
+          <w:sz w:val="22"/>
+        </w:rPr>
+        <w:t>Tabela 6. Simulação contrafactual — efeito de reduções no atraso médio</w:t>
+      </w:r>
+    </w:p>
+    <w:tbl>
+      <w:tblPr>
+        <w:tblStyle w:val="TableGrid"/>
+        <w:tblW w:type="auto" w:w="0"/>
+        <w:jc w:val="center"/>
+        <w:tblLook w:firstColumn="1" w:firstRow="1" w:lastColumn="0" w:lastRow="0" w:noHBand="0" w:noVBand="1" w:val="04A0"/>
+      </w:tblPr>
+      <w:tblGrid>
+        <w:gridCol w:w="3135"/>
+        <w:gridCol w:w="3135"/>
+        <w:gridCol w:w="3135"/>
+      </w:tblGrid>
+      <w:tr>
+        <w:tc>
+          <w:tcPr>
+            <w:tcW w:type="dxa" w:w="3135"/>
+          </w:tcPr>
+          <w:p>
+            <w:pPr>
+              <w:jc w:val="center"/>
+            </w:pPr>
+            <w:r>
+              <w:rPr>
+                <w:rFonts w:ascii="Arial" w:hAnsi="Arial"/>
+                <w:b/>
+                <w:i w:val="0"/>
+                <w:sz w:val="20"/>
+              </w:rPr>
+              <w:t>Redução no atraso (dias)</w:t>
+            </w:r>
+          </w:p>
+        </w:tc>
+        <w:tc>
+          <w:tcPr>
+            <w:tcW w:type="dxa" w:w="3135"/>
+          </w:tcPr>
+          <w:p>
+            <w:pPr>
+              <w:jc w:val="center"/>
+            </w:pPr>
+            <w:r>
+              <w:rPr>
+                <w:rFonts w:ascii="Arial" w:hAnsi="Arial"/>
+                <w:b/>
+                <w:i w:val="0"/>
+                <w:sz w:val="20"/>
+              </w:rPr>
+              <w:t>Reviews negativos previstos</w:t>
+            </w:r>
+          </w:p>
+        </w:tc>
+        <w:tc>
+          <w:tcPr>
+            <w:tcW w:type="dxa" w:w="3135"/>
+          </w:tcPr>
+          <w:p>
+            <w:pPr>
+              <w:jc w:val="center"/>
+            </w:pPr>
+            <w:r>
+              <w:rPr>
+                <w:rFonts w:ascii="Arial" w:hAnsi="Arial"/>
+                <w:b/>
+                <w:i w:val="0"/>
+                <w:sz w:val="20"/>
+              </w:rPr>
+              <w:t>Redução estimada (%)</w:t>
+            </w:r>
+          </w:p>
+        </w:tc>
+      </w:tr>
+      <w:tr>
+        <w:tc>
+          <w:tcPr>
+            <w:tcW w:type="dxa" w:w="3135"/>
+          </w:tcPr>
+          <w:p>
+            <w:r>
+              <w:rPr>
+                <w:rFonts w:ascii="Arial" w:hAnsi="Arial"/>
+                <w:b w:val="0"/>
+                <w:i w:val="0"/>
+                <w:sz w:val="20"/>
+              </w:rPr>
+              <w:t>1</w:t>
+            </w:r>
+          </w:p>
+        </w:tc>
+        <w:tc>
+          <w:tcPr>
+            <w:tcW w:type="dxa" w:w="3135"/>
+          </w:tcPr>
+          <w:p>
+            <w:pPr>
+              <w:jc w:val="center"/>
+            </w:pPr>
+            <w:r>
+              <w:rPr>
+                <w:rFonts w:ascii="Arial" w:hAnsi="Arial"/>
+                <w:b w:val="0"/>
+                <w:i w:val="0"/>
+                <w:sz w:val="20"/>
+              </w:rPr>
+              <w:t>—</w:t>
+            </w:r>
+          </w:p>
+        </w:tc>
+        <w:tc>
+          <w:tcPr>
+            <w:tcW w:type="dxa" w:w="3135"/>
+          </w:tcPr>
+          <w:p>
+            <w:pPr>
+              <w:jc w:val="center"/>
+            </w:pPr>
+            <w:r>
+              <w:rPr>
+                <w:rFonts w:ascii="Arial" w:hAnsi="Arial"/>
+                <w:b w:val="0"/>
+                <w:i w:val="0"/>
+                <w:sz w:val="20"/>
+              </w:rPr>
+              <w:t>4,3%</w:t>
+            </w:r>
+          </w:p>
+        </w:tc>
+      </w:tr>
+      <w:tr>
+        <w:tc>
+          <w:tcPr>
+            <w:tcW w:type="dxa" w:w="3135"/>
+          </w:tcPr>
+          <w:p>
+            <w:r>
+              <w:rPr>
+                <w:rFonts w:ascii="Arial" w:hAnsi="Arial"/>
+                <w:b w:val="0"/>
+                <w:i w:val="0"/>
+                <w:sz w:val="20"/>
+              </w:rPr>
+              <w:t>2</w:t>
+            </w:r>
+          </w:p>
+        </w:tc>
+        <w:tc>
+          <w:tcPr>
+            <w:tcW w:type="dxa" w:w="3135"/>
+          </w:tcPr>
+          <w:p>
+            <w:pPr>
+              <w:jc w:val="center"/>
+            </w:pPr>
+            <w:r>
+              <w:rPr>
+                <w:rFonts w:ascii="Arial" w:hAnsi="Arial"/>
+                <w:b w:val="0"/>
+                <w:i w:val="0"/>
+                <w:sz w:val="20"/>
+              </w:rPr>
+              <w:t>—</w:t>
+            </w:r>
+          </w:p>
+        </w:tc>
+        <w:tc>
+          <w:tcPr>
+            <w:tcW w:type="dxa" w:w="3135"/>
+          </w:tcPr>
+          <w:p>
+            <w:pPr>
+              <w:jc w:val="center"/>
+            </w:pPr>
+            <w:r>
+              <w:rPr>
+                <w:rFonts w:ascii="Arial" w:hAnsi="Arial"/>
+                <w:b w:val="0"/>
+                <w:i w:val="0"/>
+                <w:sz w:val="20"/>
+              </w:rPr>
+              <w:t>8,3%</w:t>
+            </w:r>
+          </w:p>
+        </w:tc>
+      </w:tr>
+      <w:tr>
+        <w:tc>
+          <w:tcPr>
+            <w:tcW w:type="dxa" w:w="3135"/>
+          </w:tcPr>
+          <w:p>
+            <w:r>
+              <w:rPr>
+                <w:rFonts w:ascii="Arial" w:hAnsi="Arial"/>
+                <w:b w:val="0"/>
+                <w:i w:val="0"/>
+                <w:sz w:val="20"/>
+              </w:rPr>
+              <w:t>3</w:t>
+            </w:r>
+          </w:p>
+        </w:tc>
+        <w:tc>
+          <w:tcPr>
+            <w:tcW w:type="dxa" w:w="3135"/>
+          </w:tcPr>
+          <w:p>
+            <w:pPr>
+              <w:jc w:val="center"/>
+            </w:pPr>
+            <w:r>
+              <w:rPr>
+                <w:rFonts w:ascii="Arial" w:hAnsi="Arial"/>
+                <w:b w:val="0"/>
+                <w:i w:val="0"/>
+                <w:sz w:val="20"/>
+              </w:rPr>
+              <w:t>—</w:t>
+            </w:r>
+          </w:p>
+        </w:tc>
+        <w:tc>
+          <w:tcPr>
+            <w:tcW w:type="dxa" w:w="3135"/>
+          </w:tcPr>
+          <w:p>
+            <w:pPr>
+              <w:jc w:val="center"/>
+            </w:pPr>
+            <w:r>
+              <w:rPr>
+                <w:rFonts w:ascii="Arial" w:hAnsi="Arial"/>
+                <w:b w:val="0"/>
+                <w:i w:val="0"/>
+                <w:sz w:val="20"/>
+              </w:rPr>
+              <w:t>12,2%</w:t>
+            </w:r>
+          </w:p>
+        </w:tc>
+      </w:tr>
+      <w:tr>
+        <w:tc>
+          <w:tcPr>
+            <w:tcW w:type="dxa" w:w="3135"/>
+          </w:tcPr>
+          <w:p>
+            <w:r>
+              <w:rPr>
+                <w:rFonts w:ascii="Arial" w:hAnsi="Arial"/>
+                <w:b w:val="0"/>
+                <w:i w:val="0"/>
+                <w:sz w:val="20"/>
+              </w:rPr>
+              <w:t>5</w:t>
+            </w:r>
+          </w:p>
+        </w:tc>
+        <w:tc>
+          <w:tcPr>
+            <w:tcW w:type="dxa" w:w="3135"/>
+          </w:tcPr>
+          <w:p>
+            <w:pPr>
+              <w:jc w:val="center"/>
+            </w:pPr>
+            <w:r>
+              <w:rPr>
+                <w:rFonts w:ascii="Arial" w:hAnsi="Arial"/>
+                <w:b w:val="0"/>
+                <w:i w:val="0"/>
+                <w:sz w:val="20"/>
+              </w:rPr>
+              <w:t>—</w:t>
+            </w:r>
+          </w:p>
+        </w:tc>
+        <w:tc>
+          <w:tcPr>
+            <w:tcW w:type="dxa" w:w="3135"/>
+          </w:tcPr>
+          <w:p>
+            <w:pPr>
+              <w:jc w:val="center"/>
+            </w:pPr>
+            <w:r>
+              <w:rPr>
+                <w:rFonts w:ascii="Arial" w:hAnsi="Arial"/>
+                <w:b w:val="0"/>
+                <w:i w:val="0"/>
+                <w:sz w:val="20"/>
+              </w:rPr>
+              <w:t>19,6%</w:t>
+            </w:r>
+          </w:p>
+        </w:tc>
+      </w:tr>
+      <w:tr>
+        <w:tc>
+          <w:tcPr>
+            <w:tcW w:type="dxa" w:w="3135"/>
+          </w:tcPr>
+          <w:p>
+            <w:r>
+              <w:rPr>
+                <w:rFonts w:ascii="Arial" w:hAnsi="Arial"/>
+                <w:b w:val="0"/>
+                <w:i w:val="0"/>
+                <w:sz w:val="20"/>
+              </w:rPr>
+              <w:t>7</w:t>
+            </w:r>
+          </w:p>
+        </w:tc>
+        <w:tc>
+          <w:tcPr>
+            <w:tcW w:type="dxa" w:w="3135"/>
+          </w:tcPr>
+          <w:p>
+            <w:pPr>
+              <w:jc w:val="center"/>
+            </w:pPr>
+            <w:r>
+              <w:rPr>
+                <w:rFonts w:ascii="Arial" w:hAnsi="Arial"/>
+                <w:b w:val="0"/>
+                <w:i w:val="0"/>
+                <w:sz w:val="20"/>
+              </w:rPr>
+              <w:t>—</w:t>
+            </w:r>
+          </w:p>
+        </w:tc>
+        <w:tc>
+          <w:tcPr>
+            <w:tcW w:type="dxa" w:w="3135"/>
+          </w:tcPr>
+          <w:p>
+            <w:pPr>
+              <w:jc w:val="center"/>
+            </w:pPr>
+            <w:r>
+              <w:rPr>
+                <w:rFonts w:ascii="Arial" w:hAnsi="Arial"/>
+                <w:b w:val="0"/>
+                <w:i w:val="0"/>
+                <w:sz w:val="20"/>
+              </w:rPr>
+              <w:t>26,3%</w:t>
+            </w:r>
+          </w:p>
+        </w:tc>
+      </w:tr>
+    </w:tbl>
+    <w:p>
+      <w:pPr>
+        <w:spacing w:before="40" w:after="40" w:line="220" w:lineRule="exact"/>
+        <w:jc w:val="left"/>
+      </w:pPr>
+      <w:r>
+        <w:rPr>
+          <w:rFonts w:ascii="Arial" w:hAnsi="Arial"/>
+          <w:b w:val="0"/>
+          <w:i w:val="0"/>
+          <w:sz w:val="18"/>
+        </w:rPr>
+        <w:t>Fonte: Resultados originais da pesquisa.</w:t>
+      </w:r>
+    </w:p>
+    <w:p>
+      <w:pPr>
+        <w:spacing w:before="0" w:after="160" w:line="220" w:lineRule="exact"/>
+        <w:jc w:val="left"/>
+      </w:pPr>
+      <w:r>
+        <w:rPr>
+          <w:rFonts w:ascii="Arial" w:hAnsi="Arial"/>
+          <w:b w:val="0"/>
+          <w:i w:val="0"/>
+          <w:sz w:val="18"/>
+        </w:rPr>
+        <w:t>Nota: Predições agregadas a partir do modelo NB2 reduzido. O cenário base corresponde aos valores observados de atraso. Reduções aplicadas de forma uniforme a todos os vendedores.</w:t>
+      </w:r>
+    </w:p>
+    <w:p>
+      <w:pPr>
+        <w:spacing w:before="200" w:after="40" w:line="220" w:lineRule="exact"/>
+        <w:jc w:val="left"/>
+      </w:pPr>
+      <w:r>
+        <w:rPr>
+          <w:rFonts w:ascii="Arial" w:hAnsi="Arial"/>
+          <w:b w:val="0"/>
+          <w:i w:val="0"/>
+          <w:sz w:val="22"/>
+        </w:rPr>
+        <w:t>Figura 8. Redução prevista de reviews negativos por cenário de melhoria no atraso</w:t>
+      </w:r>
+    </w:p>
+    <w:p>
+      <w:pPr>
+        <w:spacing w:after="40"/>
+        <w:jc w:val="center"/>
+      </w:pPr>
+      <w:r>
+        <w:drawing>
+          <wp:inline xmlns:a="http://schemas.openxmlformats.org/drawingml/2006/main" xmlns:pic="http://schemas.openxmlformats.org/drawingml/2006/picture">
+            <wp:extent cx="5029200" cy="2775704"/>
+            <wp:docPr id="8" name="Picture 8"/>
+            <wp:cNvGraphicFramePr>
+              <a:graphicFrameLocks noChangeAspect="1"/>
+            </wp:cNvGraphicFramePr>
+            <a:graphic>
+              <a:graphicData uri="http://schemas.openxmlformats.org/drawingml/2006/picture">
+                <pic:pic>
+                  <pic:nvPicPr>
+                    <pic:cNvPr id="0" name="fig_contrafactual.png"/>
+                    <pic:cNvPicPr/>
+                  </pic:nvPicPr>
+                  <pic:blipFill>
+                    <a:blip r:embed="rId16"/>
+                    <a:stretch>
+                      <a:fillRect/>
+                    </a:stretch>
+                  </pic:blipFill>
+                  <pic:spPr>
+                    <a:xfrm>
+                      <a:off x="0" y="0"/>
+                      <a:ext cx="5029200" cy="2775704"/>
+                    </a:xfrm>
+                    <a:prstGeom prst="rect"/>
+                  </pic:spPr>
+                </pic:pic>
+              </a:graphicData>
+            </a:graphic>
+          </wp:inline>
+        </w:drawing>
+      </w:r>
+    </w:p>
+    <w:p>
+      <w:pPr>
+        <w:spacing w:before="40" w:after="160" w:line="220" w:lineRule="exact"/>
+        <w:jc w:val="left"/>
+      </w:pPr>
+      <w:r>
+        <w:rPr>
+          <w:rFonts w:ascii="Arial" w:hAnsi="Arial"/>
+          <w:b w:val="0"/>
+          <w:i w:val="0"/>
+          <w:sz w:val="18"/>
+        </w:rPr>
+        <w:t>Fonte: Resultados originais da pesquisa.</w:t>
       </w:r>
     </w:p>
     <w:p>
@@ -3047,8 +4011,6 @@
       </w:r>
     </w:p>
     <w:sectPr>
-      <w:headerReference w:type="default" r:id="rId14"/>
-      <w:footerReference w:type="default" r:id="rId15"/>
       <w:pgSz w:w="12240" w:h="15840"/>
       <w:pgMar w:top="1417" w:right="1417" w:bottom="1417" w:left="1417" w:header="720" w:footer="720" w:gutter="0"/>
       <w:cols w:space="720"/>
@@ -3056,26 +4018,6 @@
     </w:sectPr>
   </w:body>
 </w:document>
-</file>
-
-<file path=word/footer1.xml><?xml version="1.0" encoding="utf-8"?>
-<w:ftr xmlns:m="http://schemas.openxmlformats.org/officeDocument/2006/math" xmlns:mc="http://schemas.openxmlformats.org/markup-compatibility/2006" xmlns:mo="http://schemas.microsoft.com/office/mac/office/2008/main" xmlns:mv="urn:schemas-microsoft-com:mac:vml" xmlns:o="urn:schemas-microsoft-com:office:office" xmlns:r="http://schemas.openxmlformats.org/officeDocument/2006/relationships" xmlns:v="urn:schemas-microsoft-com:vml" xmlns:w10="urn:schemas-microsoft-com:office:word" xmlns:w14="http://schemas.microsoft.com/office/word/2010/wordml" xmlns:w="http://schemas.openxmlformats.org/wordprocessingml/2006/main" xmlns:wne="http://schemas.microsoft.com/office/word/2006/wordml" xmlns:wp14="http://schemas.microsoft.com/office/word/2010/wordprocessingDrawing" xmlns:wp="http://schemas.openxmlformats.org/drawingml/2006/wordprocessingDrawing" xmlns:wpc="http://schemas.microsoft.com/office/word/2010/wordprocessingCanvas" xmlns:wpg="http://schemas.microsoft.com/office/word/2010/wordprocessingGroup" xmlns:wpi="http://schemas.microsoft.com/office/word/2010/wordprocessingInk" xmlns:wps="http://schemas.microsoft.com/office/word/2010/wordprocessingShape" mc:Ignorable="w14 wp14">
-  <w:p>
-    <w:pPr>
-      <w:pStyle w:val="Footer"/>
-    </w:pPr>
-  </w:p>
-</w:ftr>
-</file>
-
-<file path=word/header1.xml><?xml version="1.0" encoding="utf-8"?>
-<w:hdr xmlns:m="http://schemas.openxmlformats.org/officeDocument/2006/math" xmlns:mc="http://schemas.openxmlformats.org/markup-compatibility/2006" xmlns:mo="http://schemas.microsoft.com/office/mac/office/2008/main" xmlns:mv="urn:schemas-microsoft-com:mac:vml" xmlns:o="urn:schemas-microsoft-com:office:office" xmlns:r="http://schemas.openxmlformats.org/officeDocument/2006/relationships" xmlns:v="urn:schemas-microsoft-com:vml" xmlns:w10="urn:schemas-microsoft-com:office:word" xmlns:w14="http://schemas.microsoft.com/office/word/2010/wordml" xmlns:w="http://schemas.openxmlformats.org/wordprocessingml/2006/main" xmlns:wne="http://schemas.microsoft.com/office/word/2006/wordml" xmlns:wp14="http://schemas.microsoft.com/office/word/2010/wordprocessingDrawing" xmlns:wp="http://schemas.openxmlformats.org/drawingml/2006/wordprocessingDrawing" xmlns:wpc="http://schemas.microsoft.com/office/word/2010/wordprocessingCanvas" xmlns:wpg="http://schemas.microsoft.com/office/word/2010/wordprocessingGroup" xmlns:wpi="http://schemas.microsoft.com/office/word/2010/wordprocessingInk" xmlns:wps="http://schemas.microsoft.com/office/word/2010/wordprocessingShape" mc:Ignorable="w14 wp14">
-  <w:p>
-    <w:pPr>
-      <w:pStyle w:val="Header"/>
-    </w:pPr>
-  </w:p>
-</w:hdr>
 </file>
 
 <file path=word/numbering.xml><?xml version="1.0" encoding="utf-8"?>

</xml_diff>

<commit_message>
Preenche valores absolutos na tabela 6 (simulacao contrafactual)
</commit_message>
<xml_diff>
--- a/[Resultados Preliminares] - Maycon Henrique Aranha Da Silva.docx
+++ b/[Resultados Preliminares] - Maycon Henrique Aranha Da Silva.docx
@@ -2864,7 +2864,7 @@
       <w:r>
         <w:drawing>
           <wp:inline xmlns:a="http://schemas.openxmlformats.org/drawingml/2006/main" xmlns:pic="http://schemas.openxmlformats.org/drawingml/2006/picture">
-            <wp:extent cx="5029200" cy="3762626"/>
+            <wp:extent cx="5029200" cy="3737344"/>
             <wp:docPr id="6" name="Picture 6"/>
             <wp:cNvGraphicFramePr>
               <a:graphicFrameLocks noChangeAspect="1"/>
@@ -2885,7 +2885,7 @@
                   <pic:spPr>
                     <a:xfrm>
                       <a:off x="0" y="0"/>
-                      <a:ext cx="5029200" cy="3762626"/>
+                      <a:ext cx="5029200" cy="3737344"/>
                     </a:xfrm>
                     <a:prstGeom prst="rect"/>
                   </pic:spPr>
@@ -3225,7 +3225,7 @@
       <w:r>
         <w:drawing>
           <wp:inline xmlns:a="http://schemas.openxmlformats.org/drawingml/2006/main" xmlns:pic="http://schemas.openxmlformats.org/drawingml/2006/picture">
-            <wp:extent cx="5029200" cy="1771821"/>
+            <wp:extent cx="5029200" cy="1765956"/>
             <wp:docPr id="7" name="Picture 7"/>
             <wp:cNvGraphicFramePr>
               <a:graphicFrameLocks noChangeAspect="1"/>
@@ -3246,7 +3246,7 @@
                   <pic:spPr>
                     <a:xfrm>
                       <a:off x="0" y="0"/>
-                      <a:ext cx="5029200" cy="1771821"/>
+                      <a:ext cx="5029200" cy="1765956"/>
                     </a:xfrm>
                     <a:prstGeom prst="rect"/>
                   </pic:spPr>
@@ -3300,7 +3300,7 @@
           <w:i w:val="0"/>
           <w:sz w:val="22"/>
         </w:rPr>
-        <w:t>Para traduzir o coeficiente do atraso em consequência operacional, foi conduzida uma simulação contrafactual. Considerando o conjunto de vendedores observados, a redução do atraso médio em 1, 2, 3, 5 e 7 dias foi aplicada de forma uniforme e comparada à predição base do modelo NB2 reduzido. Os resultados estão na Tabela 6 e na Figura 8. Uma redução de 3 dias no atraso médio levaria a uma queda estimada de 12,2% no total de reviews negativos previstos pelo modelo; uma redução de 7 dias, a uma queda de 26,3%. A simulação fornece uma referência quantitativa para priorização de iniciativas de melhoria logística, ressalvada a natureza associativa do modelo.</w:t>
+        <w:t>Para traduzir o coeficiente do atraso em consequência operacional, foi conduzida uma simulação contrafactual. Considerando o conjunto de vendedores observados, a redução do atraso médio em 1, 2, 3, 5 e 7 dias foi aplicada de forma uniforme e comparada à predição base do modelo NB2 reduzido (total previsto = 11.805 reviews negativos). Os resultados estão na Tabela 6 e na Figura 8. Uma redução de 3 dias no atraso médio levaria a uma queda estimada de 12,2% no total de reviews negativos previstos pelo modelo (de 11.805 para 10.360); uma redução de 7 dias, a uma queda de 26,3% (8.705 reviews previstos). A simulação fornece uma referência quantitativa para priorização de iniciativas de melhoria logística, ressalvada a natureza associativa do modelo.</w:t>
       </w:r>
     </w:p>
     <w:p>
@@ -3402,6 +3402,62 @@
                 <w:i w:val="0"/>
                 <w:sz w:val="20"/>
               </w:rPr>
+              <w:t>0 (base)</w:t>
+            </w:r>
+          </w:p>
+        </w:tc>
+        <w:tc>
+          <w:tcPr>
+            <w:tcW w:type="dxa" w:w="3135"/>
+          </w:tcPr>
+          <w:p>
+            <w:pPr>
+              <w:jc w:val="center"/>
+            </w:pPr>
+            <w:r>
+              <w:rPr>
+                <w:rFonts w:ascii="Arial" w:hAnsi="Arial"/>
+                <w:b w:val="0"/>
+                <w:i w:val="0"/>
+                <w:sz w:val="20"/>
+              </w:rPr>
+              <w:t>11.805</w:t>
+            </w:r>
+          </w:p>
+        </w:tc>
+        <w:tc>
+          <w:tcPr>
+            <w:tcW w:type="dxa" w:w="3135"/>
+          </w:tcPr>
+          <w:p>
+            <w:pPr>
+              <w:jc w:val="center"/>
+            </w:pPr>
+            <w:r>
+              <w:rPr>
+                <w:rFonts w:ascii="Arial" w:hAnsi="Arial"/>
+                <w:b w:val="0"/>
+                <w:i w:val="0"/>
+                <w:sz w:val="20"/>
+              </w:rPr>
+              <w:t>—</w:t>
+            </w:r>
+          </w:p>
+        </w:tc>
+      </w:tr>
+      <w:tr>
+        <w:tc>
+          <w:tcPr>
+            <w:tcW w:type="dxa" w:w="3135"/>
+          </w:tcPr>
+          <w:p>
+            <w:r>
+              <w:rPr>
+                <w:rFonts w:ascii="Arial" w:hAnsi="Arial"/>
+                <w:b w:val="0"/>
+                <w:i w:val="0"/>
+                <w:sz w:val="20"/>
+              </w:rPr>
               <w:t>1</w:t>
             </w:r>
           </w:p>
@@ -3421,7 +3477,7 @@
                 <w:i w:val="0"/>
                 <w:sz w:val="20"/>
               </w:rPr>
-              <w:t>—</w:t>
+              <w:t>11.302</w:t>
             </w:r>
           </w:p>
         </w:tc>
@@ -3477,7 +3533,7 @@
                 <w:i w:val="0"/>
                 <w:sz w:val="20"/>
               </w:rPr>
-              <w:t>—</w:t>
+              <w:t>10.821</w:t>
             </w:r>
           </w:p>
         </w:tc>
@@ -3533,7 +3589,7 @@
                 <w:i w:val="0"/>
                 <w:sz w:val="20"/>
               </w:rPr>
-              <w:t>—</w:t>
+              <w:t>10.360</w:t>
             </w:r>
           </w:p>
         </w:tc>
@@ -3589,7 +3645,7 @@
                 <w:i w:val="0"/>
                 <w:sz w:val="20"/>
               </w:rPr>
-              <w:t>—</w:t>
+              <w:t>9.496</w:t>
             </w:r>
           </w:p>
         </w:tc>
@@ -3645,7 +3701,7 @@
                 <w:i w:val="0"/>
                 <w:sz w:val="20"/>
               </w:rPr>
-              <w:t>—</w:t>
+              <w:t>8.705</w:t>
             </w:r>
           </w:p>
         </w:tc>
@@ -3697,7 +3753,7 @@
           <w:i w:val="0"/>
           <w:sz w:val="18"/>
         </w:rPr>
-        <w:t>Nota: Predições agregadas a partir do modelo NB2 reduzido. O cenário base corresponde aos valores observados de atraso. Reduções aplicadas de forma uniforme a todos os vendedores.</w:t>
+        <w:t>Nota: Predições agregadas a partir do modelo NB2 reduzido. O cenário base (0 dia) corresponde aos valores observados de atraso. Reduções aplicadas de forma uniforme a todos os vendedores.</w:t>
       </w:r>
     </w:p>
     <w:p>
@@ -3723,7 +3779,7 @@
       <w:r>
         <w:drawing>
           <wp:inline xmlns:a="http://schemas.openxmlformats.org/drawingml/2006/main" xmlns:pic="http://schemas.openxmlformats.org/drawingml/2006/picture">
-            <wp:extent cx="5029200" cy="2775704"/>
+            <wp:extent cx="5029200" cy="2755209"/>
             <wp:docPr id="8" name="Picture 8"/>
             <wp:cNvGraphicFramePr>
               <a:graphicFrameLocks noChangeAspect="1"/>
@@ -3744,7 +3800,7 @@
                   <pic:spPr>
                     <a:xfrm>
                       <a:off x="0" y="0"/>
-                      <a:ext cx="5029200" cy="2775704"/>
+                      <a:ext cx="5029200" cy="2755209"/>
                     </a:xfrm>
                     <a:prstGeom prst="rect"/>
                   </pic:spPr>

</xml_diff>